<commit_message>
Ultimos cambios, primer entrega
Se hacen los ultimos cambios de la primer entrega del proyecto FummiDorado en cuanto a la documentacion, sin embargo, esta sujeto a cambios.
</commit_message>
<xml_diff>
--- a/Proyecto FummiDorado/Documentacion/Primera parte de Cristian Ramos, entrega #1.docx
+++ b/Proyecto FummiDorado/Documentacion/Primera parte de Cristian Ramos, entrega #1.docx
@@ -36,6 +36,7 @@
         <w:rPr>
           <w:b/>
           <w:bCs/>
+          <w:highlight w:val="red"/>
         </w:rPr>
         <w:t>Contextualización</w:t>
       </w:r>
@@ -43,6 +44,7 @@
         <w:rPr>
           <w:b/>
           <w:bCs/>
+          <w:highlight w:val="red"/>
         </w:rPr>
         <w:t>:</w:t>
       </w:r>
@@ -74,15 +76,9 @@
         <w:rPr>
           <w:b/>
           <w:bCs/>
-        </w:rPr>
-        <w:t>Formulación del problema</w:t>
-      </w:r>
-      <w:r>
-        <w:rPr>
-          <w:b/>
-          <w:bCs/>
-        </w:rPr>
-        <w:t>:</w:t>
+          <w:highlight w:val="red"/>
+        </w:rPr>
+        <w:t>Formulación del problema:</w:t>
       </w:r>
     </w:p>
     <w:p>
@@ -112,6 +108,7 @@
         <w:rPr>
           <w:b/>
           <w:bCs/>
+          <w:highlight w:val="red"/>
         </w:rPr>
         <w:t>Objetivo general</w:t>
       </w:r>
@@ -133,6 +130,7 @@
         <w:rPr>
           <w:b/>
           <w:bCs/>
+          <w:highlight w:val="red"/>
         </w:rPr>
         <w:lastRenderedPageBreak/>
         <w:t>Objetivos específicos</w:t>
@@ -284,6 +282,7 @@
         <w:rPr>
           <w:b/>
           <w:bCs/>
+          <w:highlight w:val="red"/>
         </w:rPr>
         <w:t>Alcance del proyecto</w:t>
       </w:r>
@@ -333,6 +332,7 @@
         <w:rPr>
           <w:b/>
           <w:bCs/>
+          <w:highlight w:val="red"/>
         </w:rPr>
         <w:t>Fase de Empatizar</w:t>
       </w:r>
@@ -845,6 +845,7 @@
         <w:rPr>
           <w:b/>
           <w:bCs/>
+          <w:highlight w:val="red"/>
         </w:rPr>
         <w:lastRenderedPageBreak/>
         <w:t>Fase de Definir</w:t>
@@ -853,6 +854,7 @@
         <w:rPr>
           <w:b/>
           <w:bCs/>
+          <w:highlight w:val="red"/>
         </w:rPr>
         <w:t>:</w:t>
       </w:r>
@@ -1089,11 +1091,45 @@
           <w:bCs/>
         </w:rPr>
       </w:pPr>
-      <w:r>
-        <w:rPr>
-          <w:b/>
-          <w:bCs/>
-        </w:rPr>
+    </w:p>
+    <w:p>
+      <w:pPr>
+        <w:rPr>
+          <w:b/>
+          <w:bCs/>
+        </w:rPr>
+      </w:pPr>
+    </w:p>
+    <w:p>
+      <w:pPr>
+        <w:rPr>
+          <w:b/>
+          <w:bCs/>
+        </w:rPr>
+      </w:pPr>
+    </w:p>
+    <w:p>
+      <w:pPr>
+        <w:rPr>
+          <w:b/>
+          <w:bCs/>
+        </w:rPr>
+      </w:pPr>
+    </w:p>
+    <w:p>
+      <w:pPr>
+        <w:rPr>
+          <w:b/>
+          <w:bCs/>
+        </w:rPr>
+      </w:pPr>
+      <w:r>
+        <w:rPr>
+          <w:b/>
+          <w:bCs/>
+          <w:highlight w:val="red"/>
+        </w:rPr>
+        <w:lastRenderedPageBreak/>
         <w:t>Fase de Idear</w:t>
       </w:r>
     </w:p>
@@ -1112,7 +1148,6 @@
         <w:t> con el equipo, orientada a resolver los puntos críticos detectados.</w:t>
       </w:r>
     </w:p>
-    <w:p/>
     <w:p>
       <w:pPr>
         <w:pStyle w:val="Prrafodelista"/>
@@ -1130,7 +1165,6 @@
           <w:b/>
           <w:bCs/>
         </w:rPr>
-        <w:lastRenderedPageBreak/>
         <w:t>Líneas de solución</w:t>
       </w:r>
       <w:r>
@@ -1210,13 +1244,6 @@
       </w:r>
     </w:p>
     <w:p>
-      <w:r>
-        <w:pict w14:anchorId="20C4CF0D">
-          <v:rect id="_x0000_i1049" style="width:0;height:0" o:hralign="center" o:hrstd="t" o:hr="t" fillcolor="#a0a0a0" stroked="f"/>
-        </w:pict>
-      </w:r>
-    </w:p>
-    <w:p>
       <w:pPr>
         <w:rPr>
           <w:b/>
@@ -1291,13 +1318,6 @@
       </w:r>
     </w:p>
     <w:p>
-      <w:r>
-        <w:pict w14:anchorId="3947F872">
-          <v:rect id="_x0000_i1050" style="width:0;height:0" o:hralign="center" o:hrstd="t" o:hr="t" fillcolor="#a0a0a0" stroked="f"/>
-        </w:pict>
-      </w:r>
-    </w:p>
-    <w:p>
       <w:pPr>
         <w:rPr>
           <w:b/>
@@ -1361,13 +1381,6 @@
       </w:r>
     </w:p>
     <w:p>
-      <w:r>
-        <w:pict w14:anchorId="1912F546">
-          <v:rect id="_x0000_i1051" style="width:0;height:0" o:hralign="center" o:hrstd="t" o:hr="t" fillcolor="#a0a0a0" stroked="f"/>
-        </w:pict>
-      </w:r>
-    </w:p>
-    <w:p>
       <w:pPr>
         <w:rPr>
           <w:b/>
@@ -1431,13 +1444,6 @@
       </w:r>
     </w:p>
     <w:p>
-      <w:r>
-        <w:pict w14:anchorId="07583954">
-          <v:rect id="_x0000_i1052" style="width:0;height:0" o:hralign="center" o:hrstd="t" o:hr="t" fillcolor="#a0a0a0" stroked="f"/>
-        </w:pict>
-      </w:r>
-    </w:p>
-    <w:p>
       <w:pPr>
         <w:rPr>
           <w:b/>
@@ -1501,6 +1507,2078 @@
       </w:r>
     </w:p>
     <w:p/>
+    <w:p/>
+    <w:p/>
+    <w:p>
+      <w:pPr>
+        <w:rPr>
+          <w:b/>
+          <w:bCs/>
+        </w:rPr>
+      </w:pPr>
+      <w:r>
+        <w:rPr>
+          <w:b/>
+          <w:bCs/>
+          <w:highlight w:val="red"/>
+        </w:rPr>
+        <w:lastRenderedPageBreak/>
+        <w:t>HISTORIAS DE USUARIO:</w:t>
+      </w:r>
+    </w:p>
+    <w:p>
+      <w:pPr>
+        <w:pStyle w:val="Prrafodelista"/>
+        <w:numPr>
+          <w:ilvl w:val="0"/>
+          <w:numId w:val="14"/>
+        </w:numPr>
+        <w:rPr>
+          <w:b/>
+          <w:bCs/>
+        </w:rPr>
+      </w:pPr>
+      <w:r>
+        <w:rPr>
+          <w:b/>
+          <w:bCs/>
+        </w:rPr>
+        <w:t>Administrador:</w:t>
+      </w:r>
+    </w:p>
+    <w:p>
+      <w:pPr>
+        <w:rPr>
+          <w:b/>
+          <w:bCs/>
+        </w:rPr>
+      </w:pPr>
+      <w:r>
+        <w:rPr>
+          <w:b/>
+          <w:bCs/>
+          <w:highlight w:val="yellow"/>
+        </w:rPr>
+        <w:t>HU01</w:t>
+      </w:r>
+    </w:p>
+    <w:p>
+      <w:pPr>
+        <w:rPr>
+          <w:b/>
+          <w:bCs/>
+        </w:rPr>
+      </w:pPr>
+      <w:r>
+        <w:rPr>
+          <w:b/>
+          <w:bCs/>
+        </w:rPr>
+        <w:t>Como</w:t>
+      </w:r>
+      <w:r>
+        <w:rPr>
+          <w:b/>
+          <w:bCs/>
+        </w:rPr>
+        <w:t xml:space="preserve">: </w:t>
+      </w:r>
+      <w:r>
+        <w:t>administrador</w:t>
+      </w:r>
+      <w:r>
+        <w:rPr>
+          <w:b/>
+          <w:bCs/>
+        </w:rPr>
+        <w:br/>
+        <w:t>Quiero</w:t>
+      </w:r>
+      <w:r>
+        <w:rPr>
+          <w:b/>
+          <w:bCs/>
+        </w:rPr>
+        <w:t>:</w:t>
+      </w:r>
+      <w:r>
+        <w:rPr>
+          <w:b/>
+          <w:bCs/>
+        </w:rPr>
+        <w:t xml:space="preserve"> </w:t>
+      </w:r>
+      <w:r>
+        <w:t>registrar nuevos usuarios con un rol específico</w:t>
+      </w:r>
+      <w:r>
+        <w:br/>
+      </w:r>
+      <w:r>
+        <w:rPr>
+          <w:b/>
+          <w:bCs/>
+        </w:rPr>
+        <w:t>Para</w:t>
+      </w:r>
+      <w:r>
+        <w:rPr>
+          <w:b/>
+          <w:bCs/>
+        </w:rPr>
+        <w:t>:</w:t>
+      </w:r>
+      <w:r>
+        <w:rPr>
+          <w:b/>
+          <w:bCs/>
+        </w:rPr>
+        <w:t xml:space="preserve"> </w:t>
+      </w:r>
+      <w:r>
+        <w:t>controlar el acceso al sistema según responsabilidades.</w:t>
+      </w:r>
+    </w:p>
+    <w:p>
+      <w:pPr>
+        <w:rPr>
+          <w:b/>
+          <w:bCs/>
+        </w:rPr>
+      </w:pPr>
+      <w:r>
+        <w:rPr>
+          <w:b/>
+          <w:bCs/>
+        </w:rPr>
+        <w:pict w14:anchorId="288315BC">
+          <v:rect id="_x0000_i1318" style="width:0;height:1.5pt" o:hralign="center" o:hrstd="t" o:hr="t" fillcolor="#a0a0a0" stroked="f"/>
+        </w:pict>
+      </w:r>
+    </w:p>
+    <w:p>
+      <w:pPr>
+        <w:rPr>
+          <w:b/>
+          <w:bCs/>
+        </w:rPr>
+      </w:pPr>
+      <w:r>
+        <w:rPr>
+          <w:b/>
+          <w:bCs/>
+          <w:highlight w:val="yellow"/>
+        </w:rPr>
+        <w:t>HU02</w:t>
+      </w:r>
+    </w:p>
+    <w:p>
+      <w:r>
+        <w:rPr>
+          <w:b/>
+          <w:bCs/>
+        </w:rPr>
+        <w:t>Como</w:t>
+      </w:r>
+      <w:r>
+        <w:rPr>
+          <w:b/>
+          <w:bCs/>
+        </w:rPr>
+        <w:t>:</w:t>
+      </w:r>
+      <w:r>
+        <w:rPr>
+          <w:b/>
+          <w:bCs/>
+        </w:rPr>
+        <w:t xml:space="preserve"> </w:t>
+      </w:r>
+      <w:r>
+        <w:t>administrador</w:t>
+      </w:r>
+      <w:r>
+        <w:br/>
+      </w:r>
+      <w:r>
+        <w:rPr>
+          <w:b/>
+          <w:bCs/>
+        </w:rPr>
+        <w:t>Quiero</w:t>
+      </w:r>
+      <w:r>
+        <w:rPr>
+          <w:b/>
+          <w:bCs/>
+        </w:rPr>
+        <w:t>:</w:t>
+      </w:r>
+      <w:r>
+        <w:rPr>
+          <w:b/>
+          <w:bCs/>
+        </w:rPr>
+        <w:t xml:space="preserve"> </w:t>
+      </w:r>
+      <w:r>
+        <w:t>crear órdenes de servicio con un código único</w:t>
+      </w:r>
+      <w:r>
+        <w:rPr>
+          <w:b/>
+          <w:bCs/>
+        </w:rPr>
+        <w:br/>
+        <w:t>Para</w:t>
+      </w:r>
+      <w:r>
+        <w:rPr>
+          <w:b/>
+          <w:bCs/>
+        </w:rPr>
+        <w:t>:</w:t>
+      </w:r>
+      <w:r>
+        <w:rPr>
+          <w:b/>
+          <w:bCs/>
+        </w:rPr>
+        <w:t xml:space="preserve"> </w:t>
+      </w:r>
+      <w:r>
+        <w:t>garantizar trazabilidad y control de cada servicio realizado.</w:t>
+      </w:r>
+    </w:p>
+    <w:p>
+      <w:pPr>
+        <w:rPr>
+          <w:b/>
+          <w:bCs/>
+        </w:rPr>
+      </w:pPr>
+      <w:r>
+        <w:pict w14:anchorId="47E5A8B6">
+          <v:rect id="_x0000_i1316" style="width:0;height:1.5pt" o:hralign="center" o:hrstd="t" o:hr="t" fillcolor="#a0a0a0" stroked="f"/>
+        </w:pict>
+      </w:r>
+    </w:p>
+    <w:p>
+      <w:pPr>
+        <w:rPr>
+          <w:b/>
+          <w:bCs/>
+        </w:rPr>
+      </w:pPr>
+      <w:r>
+        <w:rPr>
+          <w:b/>
+          <w:bCs/>
+          <w:highlight w:val="yellow"/>
+        </w:rPr>
+        <w:t>HU03</w:t>
+      </w:r>
+    </w:p>
+    <w:p>
+      <w:r>
+        <w:rPr>
+          <w:b/>
+          <w:bCs/>
+        </w:rPr>
+        <w:t>Como</w:t>
+      </w:r>
+      <w:r>
+        <w:rPr>
+          <w:b/>
+          <w:bCs/>
+        </w:rPr>
+        <w:t>:</w:t>
+      </w:r>
+      <w:r>
+        <w:rPr>
+          <w:b/>
+          <w:bCs/>
+        </w:rPr>
+        <w:t xml:space="preserve"> </w:t>
+      </w:r>
+      <w:r>
+        <w:t>administrador</w:t>
+      </w:r>
+      <w:r>
+        <w:br/>
+      </w:r>
+      <w:r>
+        <w:rPr>
+          <w:b/>
+          <w:bCs/>
+        </w:rPr>
+        <w:t>Quiero</w:t>
+      </w:r>
+      <w:r>
+        <w:rPr>
+          <w:b/>
+          <w:bCs/>
+        </w:rPr>
+        <w:t>:</w:t>
+      </w:r>
+      <w:r>
+        <w:rPr>
+          <w:b/>
+          <w:bCs/>
+        </w:rPr>
+        <w:t xml:space="preserve"> </w:t>
+      </w:r>
+      <w:r>
+        <w:t>asignar técnicos a cada orden de servicio</w:t>
+      </w:r>
+      <w:r>
+        <w:rPr>
+          <w:b/>
+          <w:bCs/>
+        </w:rPr>
+        <w:br/>
+        <w:t>Para</w:t>
+      </w:r>
+      <w:r>
+        <w:rPr>
+          <w:b/>
+          <w:bCs/>
+        </w:rPr>
+        <w:t>:</w:t>
+      </w:r>
+      <w:r>
+        <w:rPr>
+          <w:b/>
+          <w:bCs/>
+        </w:rPr>
+        <w:t xml:space="preserve"> </w:t>
+      </w:r>
+      <w:r>
+        <w:t>organizar la operación diaria de manera eficiente.</w:t>
+      </w:r>
+    </w:p>
+    <w:p>
+      <w:pPr>
+        <w:rPr>
+          <w:b/>
+          <w:bCs/>
+        </w:rPr>
+      </w:pPr>
+      <w:r>
+        <w:rPr>
+          <w:b/>
+          <w:bCs/>
+        </w:rPr>
+        <w:pict w14:anchorId="508618AC">
+          <v:rect id="_x0000_i1314" style="width:0;height:1.5pt" o:hralign="center" o:hrstd="t" o:hr="t" fillcolor="#a0a0a0" stroked="f"/>
+        </w:pict>
+      </w:r>
+    </w:p>
+    <w:p>
+      <w:pPr>
+        <w:rPr>
+          <w:b/>
+          <w:bCs/>
+        </w:rPr>
+      </w:pPr>
+      <w:r>
+        <w:rPr>
+          <w:b/>
+          <w:bCs/>
+          <w:highlight w:val="yellow"/>
+        </w:rPr>
+        <w:t>HU04</w:t>
+      </w:r>
+    </w:p>
+    <w:p>
+      <w:r>
+        <w:rPr>
+          <w:b/>
+          <w:bCs/>
+        </w:rPr>
+        <w:t>Como</w:t>
+      </w:r>
+      <w:r>
+        <w:rPr>
+          <w:b/>
+          <w:bCs/>
+        </w:rPr>
+        <w:t xml:space="preserve">: </w:t>
+      </w:r>
+      <w:r>
+        <w:t>administrador</w:t>
+      </w:r>
+      <w:r>
+        <w:br/>
+      </w:r>
+      <w:r>
+        <w:rPr>
+          <w:b/>
+          <w:bCs/>
+        </w:rPr>
+        <w:t>Quiero</w:t>
+      </w:r>
+      <w:r>
+        <w:rPr>
+          <w:b/>
+          <w:bCs/>
+        </w:rPr>
+        <w:t>:</w:t>
+      </w:r>
+      <w:r>
+        <w:rPr>
+          <w:b/>
+          <w:bCs/>
+        </w:rPr>
+        <w:t xml:space="preserve"> </w:t>
+      </w:r>
+      <w:r>
+        <w:t>visualizar las órdenes de servicio en un calendario</w:t>
+      </w:r>
+      <w:r>
+        <w:rPr>
+          <w:b/>
+          <w:bCs/>
+        </w:rPr>
+        <w:br/>
+        <w:t>Para</w:t>
+      </w:r>
+      <w:r>
+        <w:rPr>
+          <w:b/>
+          <w:bCs/>
+        </w:rPr>
+        <w:t xml:space="preserve">: </w:t>
+      </w:r>
+      <w:r>
+        <w:t>planificar mejor la programación mensual.</w:t>
+      </w:r>
+    </w:p>
+    <w:p>
+      <w:pPr>
+        <w:rPr>
+          <w:b/>
+          <w:bCs/>
+        </w:rPr>
+      </w:pPr>
+      <w:r>
+        <w:rPr>
+          <w:b/>
+          <w:bCs/>
+        </w:rPr>
+        <w:pict w14:anchorId="436D4E0F">
+          <v:rect id="_x0000_i1312" style="width:0;height:1.5pt" o:hralign="center" o:hrstd="t" o:hr="t" fillcolor="#a0a0a0" stroked="f"/>
+        </w:pict>
+      </w:r>
+    </w:p>
+    <w:p>
+      <w:pPr>
+        <w:rPr>
+          <w:b/>
+          <w:bCs/>
+        </w:rPr>
+      </w:pPr>
+      <w:r>
+        <w:rPr>
+          <w:b/>
+          <w:bCs/>
+          <w:highlight w:val="yellow"/>
+        </w:rPr>
+        <w:t>HU05</w:t>
+      </w:r>
+    </w:p>
+    <w:p>
+      <w:pPr>
+        <w:rPr>
+          <w:b/>
+          <w:bCs/>
+        </w:rPr>
+      </w:pPr>
+      <w:r>
+        <w:rPr>
+          <w:b/>
+          <w:bCs/>
+        </w:rPr>
+        <w:t>Como</w:t>
+      </w:r>
+      <w:r>
+        <w:rPr>
+          <w:b/>
+          <w:bCs/>
+        </w:rPr>
+        <w:t>:</w:t>
+      </w:r>
+      <w:r>
+        <w:rPr>
+          <w:b/>
+          <w:bCs/>
+        </w:rPr>
+        <w:t xml:space="preserve"> </w:t>
+      </w:r>
+      <w:r>
+        <w:t>administrador</w:t>
+      </w:r>
+      <w:r>
+        <w:rPr>
+          <w:b/>
+          <w:bCs/>
+        </w:rPr>
+        <w:br/>
+        <w:t>Quiero</w:t>
+      </w:r>
+      <w:r>
+        <w:rPr>
+          <w:b/>
+          <w:bCs/>
+        </w:rPr>
+        <w:t xml:space="preserve">: </w:t>
+      </w:r>
+      <w:r>
+        <w:t>modificar o reprogramar servicios</w:t>
+      </w:r>
+      <w:r>
+        <w:rPr>
+          <w:b/>
+          <w:bCs/>
+        </w:rPr>
+        <w:br/>
+        <w:t>Para</w:t>
+      </w:r>
+      <w:r>
+        <w:rPr>
+          <w:b/>
+          <w:bCs/>
+        </w:rPr>
+        <w:t>:</w:t>
+      </w:r>
+      <w:r>
+        <w:rPr>
+          <w:b/>
+          <w:bCs/>
+        </w:rPr>
+        <w:t xml:space="preserve"> </w:t>
+      </w:r>
+      <w:r>
+        <w:t>adaptarme a cambios solicitados por los clientes.</w:t>
+      </w:r>
+    </w:p>
+    <w:p>
+      <w:pPr>
+        <w:rPr>
+          <w:b/>
+          <w:bCs/>
+        </w:rPr>
+      </w:pPr>
+      <w:r>
+        <w:rPr>
+          <w:b/>
+          <w:bCs/>
+        </w:rPr>
+        <w:pict w14:anchorId="53586B8A">
+          <v:rect id="_x0000_i1205" style="width:0;height:1.5pt" o:hralign="center" o:hrstd="t" o:hr="t" fillcolor="#a0a0a0" stroked="f"/>
+        </w:pict>
+      </w:r>
+    </w:p>
+    <w:p>
+      <w:pPr>
+        <w:rPr>
+          <w:b/>
+          <w:bCs/>
+        </w:rPr>
+      </w:pPr>
+      <w:r>
+        <w:rPr>
+          <w:b/>
+          <w:bCs/>
+          <w:highlight w:val="yellow"/>
+        </w:rPr>
+        <w:t>HU06</w:t>
+      </w:r>
+    </w:p>
+    <w:p>
+      <w:r>
+        <w:rPr>
+          <w:b/>
+          <w:bCs/>
+        </w:rPr>
+        <w:t>Como</w:t>
+      </w:r>
+      <w:r>
+        <w:rPr>
+          <w:b/>
+          <w:bCs/>
+        </w:rPr>
+        <w:t>:</w:t>
+      </w:r>
+      <w:r>
+        <w:rPr>
+          <w:b/>
+          <w:bCs/>
+        </w:rPr>
+        <w:t xml:space="preserve"> </w:t>
+      </w:r>
+      <w:r>
+        <w:t>administrador</w:t>
+      </w:r>
+      <w:r>
+        <w:rPr>
+          <w:b/>
+          <w:bCs/>
+        </w:rPr>
+        <w:br/>
+        <w:t>Quiero</w:t>
+      </w:r>
+      <w:r>
+        <w:rPr>
+          <w:b/>
+          <w:bCs/>
+        </w:rPr>
+        <w:t>:</w:t>
+      </w:r>
+      <w:r>
+        <w:rPr>
+          <w:b/>
+          <w:bCs/>
+        </w:rPr>
+        <w:t xml:space="preserve"> </w:t>
+      </w:r>
+      <w:r>
+        <w:t>consultar reportes de servicios realizados</w:t>
+      </w:r>
+      <w:r>
+        <w:br/>
+      </w:r>
+      <w:r>
+        <w:rPr>
+          <w:b/>
+          <w:bCs/>
+        </w:rPr>
+        <w:t>Para</w:t>
+      </w:r>
+      <w:r>
+        <w:rPr>
+          <w:b/>
+          <w:bCs/>
+        </w:rPr>
+        <w:t>:</w:t>
+      </w:r>
+      <w:r>
+        <w:rPr>
+          <w:b/>
+          <w:bCs/>
+        </w:rPr>
+        <w:t xml:space="preserve"> </w:t>
+      </w:r>
+      <w:r>
+        <w:t>analizar el rendimiento operativo de la empresa.</w:t>
+      </w:r>
+    </w:p>
+    <w:p>
+      <w:pPr>
+        <w:rPr>
+          <w:b/>
+          <w:bCs/>
+        </w:rPr>
+      </w:pPr>
+    </w:p>
+    <w:p>
+      <w:pPr>
+        <w:rPr>
+          <w:b/>
+          <w:bCs/>
+        </w:rPr>
+      </w:pPr>
+    </w:p>
+    <w:p>
+      <w:pPr>
+        <w:rPr>
+          <w:b/>
+          <w:bCs/>
+        </w:rPr>
+      </w:pPr>
+      <w:r>
+        <w:rPr>
+          <w:b/>
+          <w:bCs/>
+          <w:highlight w:val="yellow"/>
+        </w:rPr>
+        <w:lastRenderedPageBreak/>
+        <w:t>HU07</w:t>
+      </w:r>
+    </w:p>
+    <w:p>
+      <w:r>
+        <w:rPr>
+          <w:b/>
+          <w:bCs/>
+        </w:rPr>
+        <w:t>Como</w:t>
+      </w:r>
+      <w:r>
+        <w:rPr>
+          <w:b/>
+          <w:bCs/>
+        </w:rPr>
+        <w:t>:</w:t>
+      </w:r>
+      <w:r>
+        <w:rPr>
+          <w:b/>
+          <w:bCs/>
+        </w:rPr>
+        <w:t xml:space="preserve"> </w:t>
+      </w:r>
+      <w:r>
+        <w:t>administrador</w:t>
+      </w:r>
+      <w:r>
+        <w:rPr>
+          <w:b/>
+          <w:bCs/>
+        </w:rPr>
+        <w:br/>
+        <w:t>Quiero</w:t>
+      </w:r>
+      <w:r>
+        <w:rPr>
+          <w:b/>
+          <w:bCs/>
+        </w:rPr>
+        <w:t>:</w:t>
+      </w:r>
+      <w:r>
+        <w:rPr>
+          <w:b/>
+          <w:bCs/>
+        </w:rPr>
+        <w:t xml:space="preserve"> </w:t>
+      </w:r>
+      <w:r>
+        <w:t>configurar las plantillas de los formularios digitales</w:t>
+      </w:r>
+      <w:r>
+        <w:br/>
+      </w:r>
+      <w:r>
+        <w:rPr>
+          <w:b/>
+          <w:bCs/>
+        </w:rPr>
+        <w:t>Para</w:t>
+      </w:r>
+      <w:r>
+        <w:rPr>
+          <w:b/>
+          <w:bCs/>
+        </w:rPr>
+        <w:t>:</w:t>
+      </w:r>
+      <w:r>
+        <w:rPr>
+          <w:b/>
+          <w:bCs/>
+        </w:rPr>
+        <w:t xml:space="preserve"> </w:t>
+      </w:r>
+      <w:r>
+        <w:t>adaptarlos a los distintos tipos de servicio.</w:t>
+      </w:r>
+    </w:p>
+    <w:p>
+      <w:pPr>
+        <w:rPr>
+          <w:b/>
+          <w:bCs/>
+        </w:rPr>
+      </w:pPr>
+      <w:r>
+        <w:pict w14:anchorId="00E2E172">
+          <v:rect id="_x0000_i1207" style="width:0;height:1.5pt" o:hralign="center" o:hrstd="t" o:hr="t" fillcolor="#a0a0a0" stroked="f"/>
+        </w:pict>
+      </w:r>
+    </w:p>
+    <w:p>
+      <w:pPr>
+        <w:pStyle w:val="Prrafodelista"/>
+        <w:numPr>
+          <w:ilvl w:val="0"/>
+          <w:numId w:val="14"/>
+        </w:numPr>
+        <w:rPr>
+          <w:b/>
+          <w:bCs/>
+        </w:rPr>
+      </w:pPr>
+      <w:r>
+        <w:rPr>
+          <w:b/>
+          <w:bCs/>
+        </w:rPr>
+        <w:t>Técnico</w:t>
+      </w:r>
+      <w:r>
+        <w:rPr>
+          <w:b/>
+          <w:bCs/>
+        </w:rPr>
+        <w:t>:</w:t>
+      </w:r>
+    </w:p>
+    <w:p>
+      <w:pPr>
+        <w:rPr>
+          <w:b/>
+          <w:bCs/>
+        </w:rPr>
+      </w:pPr>
+      <w:r>
+        <w:rPr>
+          <w:b/>
+          <w:bCs/>
+        </w:rPr>
+        <w:pict w14:anchorId="525B2763">
+          <v:rect id="_x0000_i1392" style="width:0;height:1.5pt" o:hralign="center" o:hrstd="t" o:hr="t" fillcolor="#a0a0a0" stroked="f"/>
+        </w:pict>
+      </w:r>
+    </w:p>
+    <w:p>
+      <w:pPr>
+        <w:rPr>
+          <w:b/>
+          <w:bCs/>
+        </w:rPr>
+      </w:pPr>
+      <w:r>
+        <w:rPr>
+          <w:b/>
+          <w:bCs/>
+          <w:highlight w:val="yellow"/>
+        </w:rPr>
+        <w:t>HU08</w:t>
+      </w:r>
+    </w:p>
+    <w:p>
+      <w:pPr>
+        <w:rPr>
+          <w:b/>
+          <w:bCs/>
+        </w:rPr>
+      </w:pPr>
+      <w:r>
+        <w:rPr>
+          <w:b/>
+          <w:bCs/>
+        </w:rPr>
+        <w:t>Como</w:t>
+      </w:r>
+      <w:r>
+        <w:rPr>
+          <w:b/>
+          <w:bCs/>
+        </w:rPr>
+        <w:t>:</w:t>
+      </w:r>
+      <w:r>
+        <w:rPr>
+          <w:b/>
+          <w:bCs/>
+        </w:rPr>
+        <w:t xml:space="preserve"> </w:t>
+      </w:r>
+      <w:r>
+        <w:t>técnico</w:t>
+      </w:r>
+      <w:r>
+        <w:rPr>
+          <w:b/>
+          <w:bCs/>
+        </w:rPr>
+        <w:br/>
+        <w:t>Quiero</w:t>
+      </w:r>
+      <w:r>
+        <w:rPr>
+          <w:b/>
+          <w:bCs/>
+        </w:rPr>
+        <w:t>:</w:t>
+      </w:r>
+      <w:r>
+        <w:rPr>
+          <w:b/>
+          <w:bCs/>
+        </w:rPr>
+        <w:t xml:space="preserve"> </w:t>
+      </w:r>
+      <w:r>
+        <w:t>ver en un mapa los servicios que tengo asignados</w:t>
+      </w:r>
+      <w:r>
+        <w:rPr>
+          <w:b/>
+          <w:bCs/>
+        </w:rPr>
+        <w:br/>
+        <w:t>Para</w:t>
+      </w:r>
+      <w:r>
+        <w:rPr>
+          <w:b/>
+          <w:bCs/>
+        </w:rPr>
+        <w:t>:</w:t>
+      </w:r>
+      <w:r>
+        <w:rPr>
+          <w:b/>
+          <w:bCs/>
+        </w:rPr>
+        <w:t xml:space="preserve"> </w:t>
+      </w:r>
+      <w:r>
+        <w:t>ubicar fácilmente las direcciones a las que debo desplazarme.</w:t>
+      </w:r>
+    </w:p>
+    <w:p>
+      <w:pPr>
+        <w:rPr>
+          <w:b/>
+          <w:bCs/>
+        </w:rPr>
+      </w:pPr>
+      <w:r>
+        <w:rPr>
+          <w:b/>
+          <w:bCs/>
+        </w:rPr>
+        <w:pict w14:anchorId="0E02DE1B">
+          <v:rect id="_x0000_i1393" style="width:0;height:1.5pt" o:hralign="center" o:hrstd="t" o:hr="t" fillcolor="#a0a0a0" stroked="f"/>
+        </w:pict>
+      </w:r>
+    </w:p>
+    <w:p>
+      <w:pPr>
+        <w:rPr>
+          <w:b/>
+          <w:bCs/>
+        </w:rPr>
+      </w:pPr>
+      <w:r>
+        <w:rPr>
+          <w:b/>
+          <w:bCs/>
+          <w:highlight w:val="yellow"/>
+        </w:rPr>
+        <w:t>HU09</w:t>
+      </w:r>
+    </w:p>
+    <w:p>
+      <w:r>
+        <w:rPr>
+          <w:b/>
+          <w:bCs/>
+        </w:rPr>
+        <w:t>Como</w:t>
+      </w:r>
+      <w:r>
+        <w:rPr>
+          <w:b/>
+          <w:bCs/>
+        </w:rPr>
+        <w:t>:</w:t>
+      </w:r>
+      <w:r>
+        <w:rPr>
+          <w:b/>
+          <w:bCs/>
+        </w:rPr>
+        <w:t xml:space="preserve"> </w:t>
+      </w:r>
+      <w:r>
+        <w:t>técnico</w:t>
+      </w:r>
+      <w:r>
+        <w:rPr>
+          <w:b/>
+          <w:bCs/>
+        </w:rPr>
+        <w:br/>
+        <w:t>Quiero</w:t>
+      </w:r>
+      <w:r>
+        <w:rPr>
+          <w:b/>
+          <w:bCs/>
+        </w:rPr>
+        <w:t>:</w:t>
+      </w:r>
+      <w:r>
+        <w:rPr>
+          <w:b/>
+          <w:bCs/>
+        </w:rPr>
+        <w:t xml:space="preserve"> </w:t>
+      </w:r>
+      <w:r>
+        <w:t>visualizar el detalle completo del servicio</w:t>
+      </w:r>
+      <w:r>
+        <w:rPr>
+          <w:b/>
+          <w:bCs/>
+        </w:rPr>
+        <w:br/>
+        <w:t>Para</w:t>
+      </w:r>
+      <w:r>
+        <w:rPr>
+          <w:b/>
+          <w:bCs/>
+        </w:rPr>
+        <w:t>:</w:t>
+      </w:r>
+      <w:r>
+        <w:rPr>
+          <w:b/>
+          <w:bCs/>
+        </w:rPr>
+        <w:t xml:space="preserve"> </w:t>
+      </w:r>
+      <w:r>
+        <w:t>conocer la información antes de ejecutarlo.</w:t>
+      </w:r>
+    </w:p>
+    <w:p>
+      <w:pPr>
+        <w:rPr>
+          <w:b/>
+          <w:bCs/>
+        </w:rPr>
+      </w:pPr>
+      <w:r>
+        <w:pict w14:anchorId="1F0F5CD2">
+          <v:rect id="_x0000_i1394" style="width:0;height:1.5pt" o:hralign="center" o:hrstd="t" o:hr="t" fillcolor="#a0a0a0" stroked="f"/>
+        </w:pict>
+      </w:r>
+    </w:p>
+    <w:p>
+      <w:pPr>
+        <w:rPr>
+          <w:b/>
+          <w:bCs/>
+        </w:rPr>
+      </w:pPr>
+      <w:r>
+        <w:rPr>
+          <w:b/>
+          <w:bCs/>
+          <w:highlight w:val="yellow"/>
+        </w:rPr>
+        <w:t>HU10</w:t>
+      </w:r>
+    </w:p>
+    <w:p>
+      <w:r>
+        <w:rPr>
+          <w:b/>
+          <w:bCs/>
+        </w:rPr>
+        <w:t>Como</w:t>
+      </w:r>
+      <w:r>
+        <w:rPr>
+          <w:b/>
+          <w:bCs/>
+        </w:rPr>
+        <w:t>:</w:t>
+      </w:r>
+      <w:r>
+        <w:rPr>
+          <w:b/>
+          <w:bCs/>
+        </w:rPr>
+        <w:t xml:space="preserve"> </w:t>
+      </w:r>
+      <w:r>
+        <w:t>técnico</w:t>
+      </w:r>
+      <w:r>
+        <w:rPr>
+          <w:b/>
+          <w:bCs/>
+        </w:rPr>
+        <w:br/>
+        <w:t>Quiero</w:t>
+      </w:r>
+      <w:r>
+        <w:rPr>
+          <w:b/>
+          <w:bCs/>
+        </w:rPr>
+        <w:t>:</w:t>
+      </w:r>
+      <w:r>
+        <w:rPr>
+          <w:b/>
+          <w:bCs/>
+        </w:rPr>
+        <w:t xml:space="preserve"> </w:t>
+      </w:r>
+      <w:r>
+        <w:t>que el formulario digital venga precargado</w:t>
+      </w:r>
+      <w:r>
+        <w:br/>
+      </w:r>
+      <w:r>
+        <w:rPr>
+          <w:b/>
+          <w:bCs/>
+        </w:rPr>
+        <w:t>Para</w:t>
+      </w:r>
+      <w:r>
+        <w:rPr>
+          <w:b/>
+          <w:bCs/>
+        </w:rPr>
+        <w:t>:</w:t>
+      </w:r>
+      <w:r>
+        <w:rPr>
+          <w:b/>
+          <w:bCs/>
+        </w:rPr>
+        <w:t xml:space="preserve"> </w:t>
+      </w:r>
+      <w:r>
+        <w:t>ahorrar tiempo y evitar errores al diligenciarlo.</w:t>
+      </w:r>
+    </w:p>
+    <w:p>
+      <w:pPr>
+        <w:rPr>
+          <w:b/>
+          <w:bCs/>
+        </w:rPr>
+      </w:pPr>
+      <w:r>
+        <w:pict w14:anchorId="2B68A1CF">
+          <v:rect id="_x0000_i1395" style="width:0;height:1.5pt" o:hralign="center" o:hrstd="t" o:hr="t" fillcolor="#a0a0a0" stroked="f"/>
+        </w:pict>
+      </w:r>
+    </w:p>
+    <w:p>
+      <w:pPr>
+        <w:rPr>
+          <w:b/>
+          <w:bCs/>
+        </w:rPr>
+      </w:pPr>
+      <w:r>
+        <w:rPr>
+          <w:b/>
+          <w:bCs/>
+          <w:highlight w:val="yellow"/>
+        </w:rPr>
+        <w:t>HU11</w:t>
+      </w:r>
+    </w:p>
+    <w:p>
+      <w:r>
+        <w:rPr>
+          <w:b/>
+          <w:bCs/>
+        </w:rPr>
+        <w:t>Como</w:t>
+      </w:r>
+      <w:r>
+        <w:rPr>
+          <w:b/>
+          <w:bCs/>
+        </w:rPr>
+        <w:t>:</w:t>
+      </w:r>
+      <w:r>
+        <w:rPr>
+          <w:b/>
+          <w:bCs/>
+        </w:rPr>
+        <w:t xml:space="preserve"> </w:t>
+      </w:r>
+      <w:r>
+        <w:t>técnico</w:t>
+      </w:r>
+      <w:r>
+        <w:rPr>
+          <w:b/>
+          <w:bCs/>
+        </w:rPr>
+        <w:br/>
+        <w:t>Quiero</w:t>
+      </w:r>
+      <w:r>
+        <w:rPr>
+          <w:b/>
+          <w:bCs/>
+        </w:rPr>
+        <w:t>:</w:t>
+      </w:r>
+      <w:r>
+        <w:rPr>
+          <w:b/>
+          <w:bCs/>
+        </w:rPr>
+        <w:t xml:space="preserve"> </w:t>
+      </w:r>
+      <w:r>
+        <w:t>diligenciar el formulario desde mi dispositivo móvil</w:t>
+      </w:r>
+      <w:r>
+        <w:br/>
+      </w:r>
+      <w:r>
+        <w:rPr>
+          <w:b/>
+          <w:bCs/>
+        </w:rPr>
+        <w:t>Para</w:t>
+      </w:r>
+      <w:r>
+        <w:rPr>
+          <w:b/>
+          <w:bCs/>
+        </w:rPr>
+        <w:t>:</w:t>
+      </w:r>
+      <w:r>
+        <w:rPr>
+          <w:b/>
+          <w:bCs/>
+        </w:rPr>
+        <w:t xml:space="preserve"> </w:t>
+      </w:r>
+      <w:r>
+        <w:t>evitar el uso de papel y reducir tiempos administrativos.</w:t>
+      </w:r>
+    </w:p>
+    <w:p>
+      <w:pPr>
+        <w:rPr>
+          <w:b/>
+          <w:bCs/>
+        </w:rPr>
+      </w:pPr>
+      <w:r>
+        <w:pict w14:anchorId="68143A8B">
+          <v:rect id="_x0000_i1396" style="width:0;height:1.5pt" o:hralign="center" o:hrstd="t" o:hr="t" fillcolor="#a0a0a0" stroked="f"/>
+        </w:pict>
+      </w:r>
+    </w:p>
+    <w:p>
+      <w:pPr>
+        <w:rPr>
+          <w:b/>
+          <w:bCs/>
+        </w:rPr>
+      </w:pPr>
+      <w:r>
+        <w:rPr>
+          <w:b/>
+          <w:bCs/>
+          <w:highlight w:val="yellow"/>
+        </w:rPr>
+        <w:t>HU12</w:t>
+      </w:r>
+    </w:p>
+    <w:p>
+      <w:pPr>
+        <w:rPr>
+          <w:b/>
+          <w:bCs/>
+        </w:rPr>
+      </w:pPr>
+      <w:r>
+        <w:rPr>
+          <w:b/>
+          <w:bCs/>
+        </w:rPr>
+        <w:t>Como</w:t>
+      </w:r>
+      <w:r>
+        <w:rPr>
+          <w:b/>
+          <w:bCs/>
+        </w:rPr>
+        <w:t>:</w:t>
+      </w:r>
+      <w:r>
+        <w:rPr>
+          <w:b/>
+          <w:bCs/>
+        </w:rPr>
+        <w:t xml:space="preserve"> </w:t>
+      </w:r>
+      <w:r>
+        <w:t>técnico</w:t>
+      </w:r>
+      <w:r>
+        <w:rPr>
+          <w:b/>
+          <w:bCs/>
+        </w:rPr>
+        <w:br/>
+        <w:t>Quiero</w:t>
+      </w:r>
+      <w:r>
+        <w:rPr>
+          <w:b/>
+          <w:bCs/>
+        </w:rPr>
+        <w:t>:</w:t>
+      </w:r>
+      <w:r>
+        <w:rPr>
+          <w:b/>
+          <w:bCs/>
+        </w:rPr>
+        <w:t xml:space="preserve"> </w:t>
+      </w:r>
+      <w:r>
+        <w:t>adjuntar fotografías como evidencia</w:t>
+      </w:r>
+      <w:r>
+        <w:rPr>
+          <w:b/>
+          <w:bCs/>
+        </w:rPr>
+        <w:br/>
+        <w:t>Para</w:t>
+      </w:r>
+      <w:r>
+        <w:rPr>
+          <w:b/>
+          <w:bCs/>
+        </w:rPr>
+        <w:t>:</w:t>
+      </w:r>
+      <w:r>
+        <w:rPr>
+          <w:b/>
+          <w:bCs/>
+        </w:rPr>
+        <w:t xml:space="preserve"> </w:t>
+      </w:r>
+      <w:r>
+        <w:t>respaldar el trabajo realizado.</w:t>
+      </w:r>
+    </w:p>
+    <w:p>
+      <w:pPr>
+        <w:rPr>
+          <w:b/>
+          <w:bCs/>
+        </w:rPr>
+      </w:pPr>
+    </w:p>
+    <w:p>
+      <w:pPr>
+        <w:rPr>
+          <w:b/>
+          <w:bCs/>
+        </w:rPr>
+      </w:pPr>
+    </w:p>
+    <w:p>
+      <w:pPr>
+        <w:rPr>
+          <w:b/>
+          <w:bCs/>
+        </w:rPr>
+      </w:pPr>
+      <w:r>
+        <w:rPr>
+          <w:b/>
+          <w:bCs/>
+          <w:highlight w:val="yellow"/>
+        </w:rPr>
+        <w:lastRenderedPageBreak/>
+        <w:t>HU13</w:t>
+      </w:r>
+    </w:p>
+    <w:p>
+      <w:r>
+        <w:rPr>
+          <w:b/>
+          <w:bCs/>
+        </w:rPr>
+        <w:t>Como</w:t>
+      </w:r>
+      <w:r>
+        <w:rPr>
+          <w:b/>
+          <w:bCs/>
+        </w:rPr>
+        <w:t>:</w:t>
+      </w:r>
+      <w:r>
+        <w:rPr>
+          <w:b/>
+          <w:bCs/>
+        </w:rPr>
+        <w:t xml:space="preserve"> </w:t>
+      </w:r>
+      <w:r>
+        <w:t>técnico</w:t>
+      </w:r>
+      <w:r>
+        <w:rPr>
+          <w:b/>
+          <w:bCs/>
+        </w:rPr>
+        <w:br/>
+        <w:t>Quiero</w:t>
+      </w:r>
+      <w:r>
+        <w:rPr>
+          <w:b/>
+          <w:bCs/>
+        </w:rPr>
+        <w:t>:</w:t>
+      </w:r>
+      <w:r>
+        <w:rPr>
+          <w:b/>
+          <w:bCs/>
+        </w:rPr>
+        <w:t xml:space="preserve"> </w:t>
+      </w:r>
+      <w:r>
+        <w:t xml:space="preserve">guardar el </w:t>
+      </w:r>
+      <w:r>
+        <w:t>formulario,</w:t>
+      </w:r>
+      <w:r>
+        <w:t xml:space="preserve"> aunque no tenga internet</w:t>
+      </w:r>
+      <w:r>
+        <w:rPr>
+          <w:b/>
+          <w:bCs/>
+        </w:rPr>
+        <w:br/>
+        <w:t>Para</w:t>
+      </w:r>
+      <w:r>
+        <w:rPr>
+          <w:b/>
+          <w:bCs/>
+        </w:rPr>
+        <w:t>:</w:t>
+      </w:r>
+      <w:r>
+        <w:rPr>
+          <w:b/>
+          <w:bCs/>
+        </w:rPr>
+        <w:t xml:space="preserve"> </w:t>
+      </w:r>
+      <w:r>
+        <w:t>no perder información durante el servicio.</w:t>
+      </w:r>
+    </w:p>
+    <w:p>
+      <w:pPr>
+        <w:rPr>
+          <w:b/>
+          <w:bCs/>
+        </w:rPr>
+      </w:pPr>
+      <w:r>
+        <w:rPr>
+          <w:b/>
+          <w:bCs/>
+        </w:rPr>
+        <w:pict w14:anchorId="66474D99">
+          <v:rect id="_x0000_i1398" style="width:0;height:1.5pt" o:hralign="center" o:hrstd="t" o:hr="t" fillcolor="#a0a0a0" stroked="f"/>
+        </w:pict>
+      </w:r>
+    </w:p>
+    <w:p>
+      <w:pPr>
+        <w:rPr>
+          <w:b/>
+          <w:bCs/>
+        </w:rPr>
+      </w:pPr>
+      <w:r>
+        <w:rPr>
+          <w:b/>
+          <w:bCs/>
+          <w:highlight w:val="yellow"/>
+        </w:rPr>
+        <w:t>HU14</w:t>
+      </w:r>
+    </w:p>
+    <w:p>
+      <w:r>
+        <w:rPr>
+          <w:b/>
+          <w:bCs/>
+        </w:rPr>
+        <w:t>Como</w:t>
+      </w:r>
+      <w:r>
+        <w:rPr>
+          <w:b/>
+          <w:bCs/>
+        </w:rPr>
+        <w:t>:</w:t>
+      </w:r>
+      <w:r>
+        <w:rPr>
+          <w:b/>
+          <w:bCs/>
+        </w:rPr>
+        <w:t xml:space="preserve"> </w:t>
+      </w:r>
+      <w:r>
+        <w:t>técnico</w:t>
+      </w:r>
+      <w:r>
+        <w:rPr>
+          <w:b/>
+          <w:bCs/>
+        </w:rPr>
+        <w:br/>
+        <w:t>Quiero</w:t>
+      </w:r>
+      <w:r>
+        <w:rPr>
+          <w:b/>
+          <w:bCs/>
+        </w:rPr>
+        <w:t>:</w:t>
+      </w:r>
+      <w:r>
+        <w:rPr>
+          <w:b/>
+          <w:bCs/>
+        </w:rPr>
+        <w:t xml:space="preserve"> </w:t>
+      </w:r>
+      <w:r>
+        <w:t>que la información se sincronice automáticamente</w:t>
+      </w:r>
+      <w:r>
+        <w:rPr>
+          <w:b/>
+          <w:bCs/>
+        </w:rPr>
+        <w:br/>
+        <w:t>Para</w:t>
+      </w:r>
+      <w:r>
+        <w:rPr>
+          <w:b/>
+          <w:bCs/>
+        </w:rPr>
+        <w:t>:</w:t>
+      </w:r>
+      <w:r>
+        <w:rPr>
+          <w:b/>
+          <w:bCs/>
+        </w:rPr>
+        <w:t xml:space="preserve"> </w:t>
+      </w:r>
+      <w:r>
+        <w:t>no tener que enviarla manualmente después.</w:t>
+      </w:r>
+    </w:p>
+    <w:p>
+      <w:pPr>
+        <w:rPr>
+          <w:b/>
+          <w:bCs/>
+        </w:rPr>
+      </w:pPr>
+      <w:r>
+        <w:rPr>
+          <w:b/>
+          <w:bCs/>
+        </w:rPr>
+        <w:pict w14:anchorId="2D692AAA">
+          <v:rect id="_x0000_i1400" style="width:0;height:1.5pt" o:hralign="center" o:hrstd="t" o:hr="t" fillcolor="#a0a0a0" stroked="f"/>
+        </w:pict>
+      </w:r>
+    </w:p>
+    <w:p>
+      <w:pPr>
+        <w:pStyle w:val="Prrafodelista"/>
+        <w:numPr>
+          <w:ilvl w:val="0"/>
+          <w:numId w:val="14"/>
+        </w:numPr>
+        <w:rPr>
+          <w:b/>
+          <w:bCs/>
+        </w:rPr>
+      </w:pPr>
+      <w:r>
+        <w:rPr>
+          <w:b/>
+          <w:bCs/>
+        </w:rPr>
+        <w:t>Cliente</w:t>
+      </w:r>
+      <w:r>
+        <w:rPr>
+          <w:b/>
+          <w:bCs/>
+        </w:rPr>
+        <w:t>:</w:t>
+      </w:r>
+    </w:p>
+    <w:p>
+      <w:pPr>
+        <w:rPr>
+          <w:b/>
+          <w:bCs/>
+        </w:rPr>
+      </w:pPr>
+      <w:r>
+        <w:rPr>
+          <w:b/>
+          <w:bCs/>
+        </w:rPr>
+        <w:pict w14:anchorId="369682DE">
+          <v:rect id="_x0000_i1401" style="width:0;height:1.5pt" o:hralign="center" o:hrstd="t" o:hr="t" fillcolor="#a0a0a0" stroked="f"/>
+        </w:pict>
+      </w:r>
+    </w:p>
+    <w:p>
+      <w:pPr>
+        <w:rPr>
+          <w:b/>
+          <w:bCs/>
+        </w:rPr>
+      </w:pPr>
+      <w:r>
+        <w:rPr>
+          <w:b/>
+          <w:bCs/>
+          <w:highlight w:val="yellow"/>
+        </w:rPr>
+        <w:t>HU15</w:t>
+      </w:r>
+    </w:p>
+    <w:p>
+      <w:pPr>
+        <w:rPr>
+          <w:b/>
+          <w:bCs/>
+        </w:rPr>
+      </w:pPr>
+      <w:r>
+        <w:rPr>
+          <w:b/>
+          <w:bCs/>
+        </w:rPr>
+        <w:t>Como</w:t>
+      </w:r>
+      <w:r>
+        <w:rPr>
+          <w:b/>
+          <w:bCs/>
+        </w:rPr>
+        <w:t>:</w:t>
+      </w:r>
+      <w:r>
+        <w:rPr>
+          <w:b/>
+          <w:bCs/>
+        </w:rPr>
+        <w:t xml:space="preserve"> </w:t>
+      </w:r>
+      <w:r>
+        <w:t>cliente</w:t>
+      </w:r>
+      <w:r>
+        <w:rPr>
+          <w:b/>
+          <w:bCs/>
+        </w:rPr>
+        <w:br/>
+        <w:t>Quiero</w:t>
+      </w:r>
+      <w:r>
+        <w:rPr>
+          <w:b/>
+          <w:bCs/>
+        </w:rPr>
+        <w:t>:</w:t>
+      </w:r>
+      <w:r>
+        <w:rPr>
+          <w:b/>
+          <w:bCs/>
+        </w:rPr>
+        <w:t xml:space="preserve"> </w:t>
+      </w:r>
+      <w:r>
+        <w:t>consultar el historial de servicios de mis sedes</w:t>
+      </w:r>
+      <w:r>
+        <w:br/>
+      </w:r>
+      <w:r>
+        <w:rPr>
+          <w:b/>
+          <w:bCs/>
+        </w:rPr>
+        <w:t>Para</w:t>
+      </w:r>
+      <w:r>
+        <w:rPr>
+          <w:b/>
+          <w:bCs/>
+        </w:rPr>
+        <w:t>:</w:t>
+      </w:r>
+      <w:r>
+        <w:rPr>
+          <w:b/>
+          <w:bCs/>
+        </w:rPr>
+        <w:t xml:space="preserve"> </w:t>
+      </w:r>
+      <w:r>
+        <w:t>llevar control del cumplimiento de los mantenimientos.</w:t>
+      </w:r>
+    </w:p>
+    <w:p>
+      <w:pPr>
+        <w:rPr>
+          <w:b/>
+          <w:bCs/>
+        </w:rPr>
+      </w:pPr>
+      <w:r>
+        <w:rPr>
+          <w:b/>
+          <w:bCs/>
+        </w:rPr>
+        <w:pict w14:anchorId="47274096">
+          <v:rect id="_x0000_i1402" style="width:0;height:1.5pt" o:hralign="center" o:hrstd="t" o:hr="t" fillcolor="#a0a0a0" stroked="f"/>
+        </w:pict>
+      </w:r>
+    </w:p>
+    <w:p>
+      <w:pPr>
+        <w:rPr>
+          <w:b/>
+          <w:bCs/>
+        </w:rPr>
+      </w:pPr>
+      <w:r>
+        <w:rPr>
+          <w:b/>
+          <w:bCs/>
+          <w:highlight w:val="yellow"/>
+        </w:rPr>
+        <w:t>HU16</w:t>
+      </w:r>
+    </w:p>
+    <w:p>
+      <w:r>
+        <w:rPr>
+          <w:b/>
+          <w:bCs/>
+        </w:rPr>
+        <w:t>Como</w:t>
+      </w:r>
+      <w:r>
+        <w:rPr>
+          <w:b/>
+          <w:bCs/>
+        </w:rPr>
+        <w:t>:</w:t>
+      </w:r>
+      <w:r>
+        <w:rPr>
+          <w:b/>
+          <w:bCs/>
+        </w:rPr>
+        <w:t xml:space="preserve"> </w:t>
+      </w:r>
+      <w:r>
+        <w:t>cliente</w:t>
+      </w:r>
+      <w:r>
+        <w:rPr>
+          <w:b/>
+          <w:bCs/>
+        </w:rPr>
+        <w:br/>
+        <w:t>Quiero</w:t>
+      </w:r>
+      <w:r>
+        <w:rPr>
+          <w:b/>
+          <w:bCs/>
+        </w:rPr>
+        <w:t>:</w:t>
+      </w:r>
+      <w:r>
+        <w:rPr>
+          <w:b/>
+          <w:bCs/>
+        </w:rPr>
+        <w:t xml:space="preserve"> </w:t>
+      </w:r>
+      <w:r>
+        <w:t>descargar el certificado digital del servicio</w:t>
+      </w:r>
+      <w:r>
+        <w:rPr>
+          <w:b/>
+          <w:bCs/>
+        </w:rPr>
+        <w:br/>
+        <w:t>Para</w:t>
+      </w:r>
+      <w:r>
+        <w:rPr>
+          <w:b/>
+          <w:bCs/>
+        </w:rPr>
+        <w:t>:</w:t>
+      </w:r>
+      <w:r>
+        <w:rPr>
+          <w:b/>
+          <w:bCs/>
+        </w:rPr>
+        <w:t xml:space="preserve"> </w:t>
+      </w:r>
+      <w:r>
+        <w:t>tener soporte oficial de que el servicio fue realizado.</w:t>
+      </w:r>
+    </w:p>
+    <w:p>
+      <w:pPr>
+        <w:rPr>
+          <w:b/>
+          <w:bCs/>
+        </w:rPr>
+      </w:pPr>
+      <w:r>
+        <w:rPr>
+          <w:b/>
+          <w:bCs/>
+        </w:rPr>
+        <w:pict w14:anchorId="47E58E56">
+          <v:rect id="_x0000_i1403" style="width:0;height:1.5pt" o:hralign="center" o:hrstd="t" o:hr="t" fillcolor="#a0a0a0" stroked="f"/>
+        </w:pict>
+      </w:r>
+    </w:p>
+    <w:p>
+      <w:pPr>
+        <w:rPr>
+          <w:b/>
+          <w:bCs/>
+        </w:rPr>
+      </w:pPr>
+      <w:r>
+        <w:rPr>
+          <w:b/>
+          <w:bCs/>
+          <w:highlight w:val="yellow"/>
+        </w:rPr>
+        <w:t>HU17</w:t>
+      </w:r>
+    </w:p>
+    <w:p>
+      <w:r>
+        <w:rPr>
+          <w:b/>
+          <w:bCs/>
+        </w:rPr>
+        <w:t>Como</w:t>
+      </w:r>
+      <w:r>
+        <w:rPr>
+          <w:b/>
+          <w:bCs/>
+        </w:rPr>
+        <w:t>:</w:t>
+      </w:r>
+      <w:r>
+        <w:rPr>
+          <w:b/>
+          <w:bCs/>
+        </w:rPr>
+        <w:t xml:space="preserve"> </w:t>
+      </w:r>
+      <w:r>
+        <w:t>cliente</w:t>
+      </w:r>
+      <w:r>
+        <w:rPr>
+          <w:b/>
+          <w:bCs/>
+        </w:rPr>
+        <w:br/>
+        <w:t>Quiero</w:t>
+      </w:r>
+      <w:r>
+        <w:rPr>
+          <w:b/>
+          <w:bCs/>
+        </w:rPr>
+        <w:t>:</w:t>
+      </w:r>
+      <w:r>
+        <w:rPr>
+          <w:b/>
+          <w:bCs/>
+        </w:rPr>
+        <w:t xml:space="preserve"> </w:t>
+      </w:r>
+      <w:r>
+        <w:t>recibir una notificación cuando el servicio finalice</w:t>
+      </w:r>
+      <w:r>
+        <w:rPr>
+          <w:b/>
+          <w:bCs/>
+        </w:rPr>
+        <w:br/>
+        <w:t>Para</w:t>
+      </w:r>
+      <w:r>
+        <w:rPr>
+          <w:b/>
+          <w:bCs/>
+        </w:rPr>
+        <w:t>:</w:t>
+      </w:r>
+      <w:r>
+        <w:rPr>
+          <w:b/>
+          <w:bCs/>
+        </w:rPr>
+        <w:t xml:space="preserve"> </w:t>
+      </w:r>
+      <w:r>
+        <w:t>saber cuándo está disponible el certificado.</w:t>
+      </w:r>
+    </w:p>
+    <w:p>
+      <w:r>
+        <w:rPr>
+          <w:b/>
+          <w:bCs/>
+        </w:rPr>
+        <w:pict w14:anchorId="0C24087F">
+          <v:rect id="_x0000_i1430" style="width:0;height:1.5pt" o:hralign="center" o:hrstd="t" o:hr="t" fillcolor="#a0a0a0" stroked="f"/>
+        </w:pict>
+      </w:r>
+    </w:p>
+    <w:p>
+      <w:pPr>
+        <w:rPr>
+          <w:b/>
+          <w:bCs/>
+        </w:rPr>
+      </w:pPr>
+      <w:r>
+        <w:rPr>
+          <w:b/>
+          <w:bCs/>
+          <w:highlight w:val="yellow"/>
+        </w:rPr>
+        <w:t>HU</w:t>
+      </w:r>
+      <w:r>
+        <w:rPr>
+          <w:b/>
+          <w:bCs/>
+          <w:highlight w:val="yellow"/>
+        </w:rPr>
+        <w:t>18</w:t>
+      </w:r>
+    </w:p>
+    <w:p>
+      <w:r>
+        <w:rPr>
+          <w:b/>
+          <w:bCs/>
+        </w:rPr>
+        <w:t>Como</w:t>
+      </w:r>
+      <w:r>
+        <w:rPr>
+          <w:b/>
+          <w:bCs/>
+        </w:rPr>
+        <w:t>:</w:t>
+      </w:r>
+      <w:r>
+        <w:t xml:space="preserve"> cliente</w:t>
+      </w:r>
+      <w:r>
+        <w:br/>
+      </w:r>
+      <w:r>
+        <w:rPr>
+          <w:b/>
+          <w:bCs/>
+        </w:rPr>
+        <w:t>Quiero</w:t>
+      </w:r>
+      <w:r>
+        <w:rPr>
+          <w:b/>
+          <w:bCs/>
+        </w:rPr>
+        <w:t>:</w:t>
+      </w:r>
+      <w:r>
+        <w:t xml:space="preserve"> consultar el estado actual de un servicio programado</w:t>
+      </w:r>
+      <w:r>
+        <w:br/>
+      </w:r>
+      <w:r>
+        <w:rPr>
+          <w:b/>
+          <w:bCs/>
+        </w:rPr>
+        <w:t>Para</w:t>
+      </w:r>
+      <w:r>
+        <w:rPr>
+          <w:b/>
+          <w:bCs/>
+        </w:rPr>
+        <w:t>:</w:t>
+      </w:r>
+      <w:r>
+        <w:t xml:space="preserve"> saber si está pendiente, en proceso o finalizado.</w:t>
+      </w:r>
+    </w:p>
+    <w:p/>
+    <w:p>
+      <w:pPr>
+        <w:rPr>
+          <w:b/>
+          <w:bCs/>
+        </w:rPr>
+      </w:pPr>
+    </w:p>
     <w:sectPr>
       <w:pgSz w:w="12240" w:h="15840"/>
       <w:pgMar w:top="1417" w:right="1701" w:bottom="1417" w:left="1701" w:header="708" w:footer="708" w:gutter="0"/>
@@ -1514,6 +3592,119 @@
 <file path=word/numbering.xml><?xml version="1.0" encoding="utf-8"?>
 <w:numbering xmlns:wpc="http://schemas.microsoft.com/office/word/2010/wordprocessingCanvas" xmlns:cx="http://schemas.microsoft.com/office/drawing/2014/chartex" xmlns:cx1="http://schemas.microsoft.com/office/drawing/2015/9/8/chartex" xmlns:cx2="http://schemas.microsoft.com/office/drawing/2015/10/21/chartex" xmlns:cx3="http://schemas.microsoft.com/office/drawing/2016/5/9/chartex" xmlns:cx4="http://schemas.microsoft.com/office/drawing/2016/5/10/chartex" xmlns:cx5="http://schemas.microsoft.com/office/drawing/2016/5/11/chartex" xmlns:cx6="http://schemas.microsoft.com/office/drawing/2016/5/12/chartex" xmlns:cx7="http://schemas.microsoft.com/office/drawing/2016/5/13/chartex" xmlns:cx8="http://schemas.microsoft.com/office/drawing/2016/5/14/chartex" xmlns:mc="http://schemas.openxmlformats.org/markup-compatibility/2006" xmlns:aink="http://schemas.microsoft.com/office/drawing/2016/ink" xmlns:am3d="http://schemas.microsoft.com/office/drawing/2017/model3d" xmlns:o="urn:schemas-microsoft-com:office:office" xmlns:oel="http://schemas.microsoft.com/office/2019/extlst" xmlns:r="http://schemas.openxmlformats.org/officeDocument/2006/relationships" xmlns:m="http://schemas.openxmlformats.org/officeDocument/2006/math" xmlns:v="urn:schemas-microsoft-com:vml" xmlns:wp14="http://schemas.microsoft.com/office/word/2010/wordprocessingDrawing" xmlns:wp="http://schemas.openxmlformats.org/drawingml/2006/wordprocessingDrawing" xmlns:w10="urn:schemas-microsoft-com:office:word" xmlns:w="http://schemas.openxmlformats.org/wordprocessingml/2006/main" xmlns:w14="http://schemas.microsoft.com/office/word/2010/wordml" xmlns:w15="http://schemas.microsoft.com/office/word/2012/wordml" xmlns:w16cex="http://schemas.microsoft.com/office/word/2018/wordml/cex" xmlns:w16cid="http://schemas.microsoft.com/office/word/2016/wordml/cid" xmlns:w16="http://schemas.microsoft.com/office/word/2018/wordml" xmlns:w16du="http://schemas.microsoft.com/office/word/2023/wordml/word16du" xmlns:w16sdtdh="http://schemas.microsoft.com/office/word/2020/wordml/sdtdatahash" xmlns:w16sdtfl="http://schemas.microsoft.com/office/word/2024/wordml/sdtformatlock" xmlns:w16se="http://schemas.microsoft.com/office/word/2015/wordml/symex" xmlns:wpg="http://schemas.microsoft.com/office/word/2010/wordprocessingGroup" xmlns:wpi="http://schemas.microsoft.com/office/word/2010/wordprocessingInk" xmlns:wne="http://schemas.microsoft.com/office/word/2006/wordml" xmlns:wps="http://schemas.microsoft.com/office/word/2010/wordprocessingShape" mc:Ignorable="w14 w15 w16se w16cid w16 w16cex w16sdtdh w16sdtfl w16du wp14">
   <w:abstractNum w:abstractNumId="0" w15:restartNumberingAfterBreak="0">
+    <w:nsid w:val="02134873"/>
+    <w:multiLevelType w:val="hybridMultilevel"/>
+    <w:tmpl w:val="CA20EB9E"/>
+    <w:lvl w:ilvl="0" w:tplc="240A0001">
+      <w:start w:val="1"/>
+      <w:numFmt w:val="bullet"/>
+      <w:lvlText w:val=""/>
+      <w:lvlJc w:val="left"/>
+      <w:pPr>
+        <w:ind w:left="720" w:hanging="360"/>
+      </w:pPr>
+      <w:rPr>
+        <w:rFonts w:ascii="Symbol" w:hAnsi="Symbol" w:hint="default"/>
+      </w:rPr>
+    </w:lvl>
+    <w:lvl w:ilvl="1" w:tplc="240A0003" w:tentative="1">
+      <w:start w:val="1"/>
+      <w:numFmt w:val="bullet"/>
+      <w:lvlText w:val="o"/>
+      <w:lvlJc w:val="left"/>
+      <w:pPr>
+        <w:ind w:left="1440" w:hanging="360"/>
+      </w:pPr>
+      <w:rPr>
+        <w:rFonts w:ascii="Courier New" w:hAnsi="Courier New" w:cs="Courier New" w:hint="default"/>
+      </w:rPr>
+    </w:lvl>
+    <w:lvl w:ilvl="2" w:tplc="240A0005" w:tentative="1">
+      <w:start w:val="1"/>
+      <w:numFmt w:val="bullet"/>
+      <w:lvlText w:val=""/>
+      <w:lvlJc w:val="left"/>
+      <w:pPr>
+        <w:ind w:left="2160" w:hanging="360"/>
+      </w:pPr>
+      <w:rPr>
+        <w:rFonts w:ascii="Wingdings" w:hAnsi="Wingdings" w:hint="default"/>
+      </w:rPr>
+    </w:lvl>
+    <w:lvl w:ilvl="3" w:tplc="240A0001" w:tentative="1">
+      <w:start w:val="1"/>
+      <w:numFmt w:val="bullet"/>
+      <w:lvlText w:val=""/>
+      <w:lvlJc w:val="left"/>
+      <w:pPr>
+        <w:ind w:left="2880" w:hanging="360"/>
+      </w:pPr>
+      <w:rPr>
+        <w:rFonts w:ascii="Symbol" w:hAnsi="Symbol" w:hint="default"/>
+      </w:rPr>
+    </w:lvl>
+    <w:lvl w:ilvl="4" w:tplc="240A0003" w:tentative="1">
+      <w:start w:val="1"/>
+      <w:numFmt w:val="bullet"/>
+      <w:lvlText w:val="o"/>
+      <w:lvlJc w:val="left"/>
+      <w:pPr>
+        <w:ind w:left="3600" w:hanging="360"/>
+      </w:pPr>
+      <w:rPr>
+        <w:rFonts w:ascii="Courier New" w:hAnsi="Courier New" w:cs="Courier New" w:hint="default"/>
+      </w:rPr>
+    </w:lvl>
+    <w:lvl w:ilvl="5" w:tplc="240A0005" w:tentative="1">
+      <w:start w:val="1"/>
+      <w:numFmt w:val="bullet"/>
+      <w:lvlText w:val=""/>
+      <w:lvlJc w:val="left"/>
+      <w:pPr>
+        <w:ind w:left="4320" w:hanging="360"/>
+      </w:pPr>
+      <w:rPr>
+        <w:rFonts w:ascii="Wingdings" w:hAnsi="Wingdings" w:hint="default"/>
+      </w:rPr>
+    </w:lvl>
+    <w:lvl w:ilvl="6" w:tplc="240A0001" w:tentative="1">
+      <w:start w:val="1"/>
+      <w:numFmt w:val="bullet"/>
+      <w:lvlText w:val=""/>
+      <w:lvlJc w:val="left"/>
+      <w:pPr>
+        <w:ind w:left="5040" w:hanging="360"/>
+      </w:pPr>
+      <w:rPr>
+        <w:rFonts w:ascii="Symbol" w:hAnsi="Symbol" w:hint="default"/>
+      </w:rPr>
+    </w:lvl>
+    <w:lvl w:ilvl="7" w:tplc="240A0003" w:tentative="1">
+      <w:start w:val="1"/>
+      <w:numFmt w:val="bullet"/>
+      <w:lvlText w:val="o"/>
+      <w:lvlJc w:val="left"/>
+      <w:pPr>
+        <w:ind w:left="5760" w:hanging="360"/>
+      </w:pPr>
+      <w:rPr>
+        <w:rFonts w:ascii="Courier New" w:hAnsi="Courier New" w:cs="Courier New" w:hint="default"/>
+      </w:rPr>
+    </w:lvl>
+    <w:lvl w:ilvl="8" w:tplc="240A0005" w:tentative="1">
+      <w:start w:val="1"/>
+      <w:numFmt w:val="bullet"/>
+      <w:lvlText w:val=""/>
+      <w:lvlJc w:val="left"/>
+      <w:pPr>
+        <w:ind w:left="6480" w:hanging="360"/>
+      </w:pPr>
+      <w:rPr>
+        <w:rFonts w:ascii="Wingdings" w:hAnsi="Wingdings" w:hint="default"/>
+      </w:rPr>
+    </w:lvl>
+  </w:abstractNum>
+  <w:abstractNum w:abstractNumId="1" w15:restartNumberingAfterBreak="0">
     <w:nsid w:val="09A10BD8"/>
     <w:multiLevelType w:val="hybridMultilevel"/>
     <w:tmpl w:val="4844ED54"/>
@@ -1626,7 +3817,7 @@
       </w:rPr>
     </w:lvl>
   </w:abstractNum>
-  <w:abstractNum w:abstractNumId="1" w15:restartNumberingAfterBreak="0">
+  <w:abstractNum w:abstractNumId="2" w15:restartNumberingAfterBreak="0">
     <w:nsid w:val="0E1B5631"/>
     <w:multiLevelType w:val="hybridMultilevel"/>
     <w:tmpl w:val="A3488EF2"/>
@@ -1739,7 +3930,7 @@
       </w:rPr>
     </w:lvl>
   </w:abstractNum>
-  <w:abstractNum w:abstractNumId="2" w15:restartNumberingAfterBreak="0">
+  <w:abstractNum w:abstractNumId="3" w15:restartNumberingAfterBreak="0">
     <w:nsid w:val="2D612185"/>
     <w:multiLevelType w:val="multilevel"/>
     <w:tmpl w:val="1C5C65A8"/>
@@ -1888,7 +4079,7 @@
       </w:rPr>
     </w:lvl>
   </w:abstractNum>
-  <w:abstractNum w:abstractNumId="3" w15:restartNumberingAfterBreak="0">
+  <w:abstractNum w:abstractNumId="4" w15:restartNumberingAfterBreak="0">
     <w:nsid w:val="3B0F00E1"/>
     <w:multiLevelType w:val="multilevel"/>
     <w:tmpl w:val="F0405D0C"/>
@@ -2037,7 +4228,7 @@
       </w:rPr>
     </w:lvl>
   </w:abstractNum>
-  <w:abstractNum w:abstractNumId="4" w15:restartNumberingAfterBreak="0">
+  <w:abstractNum w:abstractNumId="5" w15:restartNumberingAfterBreak="0">
     <w:nsid w:val="4156483B"/>
     <w:multiLevelType w:val="multilevel"/>
     <w:tmpl w:val="74462174"/>
@@ -2154,7 +4345,7 @@
       </w:pPr>
     </w:lvl>
   </w:abstractNum>
-  <w:abstractNum w:abstractNumId="5" w15:restartNumberingAfterBreak="0">
+  <w:abstractNum w:abstractNumId="6" w15:restartNumberingAfterBreak="0">
     <w:nsid w:val="417E433D"/>
     <w:multiLevelType w:val="multilevel"/>
     <w:tmpl w:val="7D64D7F4"/>
@@ -2303,7 +4494,93 @@
       </w:rPr>
     </w:lvl>
   </w:abstractNum>
-  <w:abstractNum w:abstractNumId="6" w15:restartNumberingAfterBreak="0">
+  <w:abstractNum w:abstractNumId="7" w15:restartNumberingAfterBreak="0">
+    <w:nsid w:val="4C065643"/>
+    <w:multiLevelType w:val="hybridMultilevel"/>
+    <w:tmpl w:val="356A7D78"/>
+    <w:lvl w:ilvl="0" w:tplc="240A000F">
+      <w:start w:val="1"/>
+      <w:numFmt w:val="decimal"/>
+      <w:lvlText w:val="%1."/>
+      <w:lvlJc w:val="left"/>
+      <w:pPr>
+        <w:ind w:left="720" w:hanging="360"/>
+      </w:pPr>
+    </w:lvl>
+    <w:lvl w:ilvl="1" w:tplc="240A0019" w:tentative="1">
+      <w:start w:val="1"/>
+      <w:numFmt w:val="lowerLetter"/>
+      <w:lvlText w:val="%2."/>
+      <w:lvlJc w:val="left"/>
+      <w:pPr>
+        <w:ind w:left="1440" w:hanging="360"/>
+      </w:pPr>
+    </w:lvl>
+    <w:lvl w:ilvl="2" w:tplc="240A001B" w:tentative="1">
+      <w:start w:val="1"/>
+      <w:numFmt w:val="lowerRoman"/>
+      <w:lvlText w:val="%3."/>
+      <w:lvlJc w:val="right"/>
+      <w:pPr>
+        <w:ind w:left="2160" w:hanging="180"/>
+      </w:pPr>
+    </w:lvl>
+    <w:lvl w:ilvl="3" w:tplc="240A000F" w:tentative="1">
+      <w:start w:val="1"/>
+      <w:numFmt w:val="decimal"/>
+      <w:lvlText w:val="%4."/>
+      <w:lvlJc w:val="left"/>
+      <w:pPr>
+        <w:ind w:left="2880" w:hanging="360"/>
+      </w:pPr>
+    </w:lvl>
+    <w:lvl w:ilvl="4" w:tplc="240A0019" w:tentative="1">
+      <w:start w:val="1"/>
+      <w:numFmt w:val="lowerLetter"/>
+      <w:lvlText w:val="%5."/>
+      <w:lvlJc w:val="left"/>
+      <w:pPr>
+        <w:ind w:left="3600" w:hanging="360"/>
+      </w:pPr>
+    </w:lvl>
+    <w:lvl w:ilvl="5" w:tplc="240A001B" w:tentative="1">
+      <w:start w:val="1"/>
+      <w:numFmt w:val="lowerRoman"/>
+      <w:lvlText w:val="%6."/>
+      <w:lvlJc w:val="right"/>
+      <w:pPr>
+        <w:ind w:left="4320" w:hanging="180"/>
+      </w:pPr>
+    </w:lvl>
+    <w:lvl w:ilvl="6" w:tplc="240A000F" w:tentative="1">
+      <w:start w:val="1"/>
+      <w:numFmt w:val="decimal"/>
+      <w:lvlText w:val="%7."/>
+      <w:lvlJc w:val="left"/>
+      <w:pPr>
+        <w:ind w:left="5040" w:hanging="360"/>
+      </w:pPr>
+    </w:lvl>
+    <w:lvl w:ilvl="7" w:tplc="240A0019" w:tentative="1">
+      <w:start w:val="1"/>
+      <w:numFmt w:val="lowerLetter"/>
+      <w:lvlText w:val="%8."/>
+      <w:lvlJc w:val="left"/>
+      <w:pPr>
+        <w:ind w:left="5760" w:hanging="360"/>
+      </w:pPr>
+    </w:lvl>
+    <w:lvl w:ilvl="8" w:tplc="240A001B" w:tentative="1">
+      <w:start w:val="1"/>
+      <w:numFmt w:val="lowerRoman"/>
+      <w:lvlText w:val="%9."/>
+      <w:lvlJc w:val="right"/>
+      <w:pPr>
+        <w:ind w:left="6480" w:hanging="180"/>
+      </w:pPr>
+    </w:lvl>
+  </w:abstractNum>
+  <w:abstractNum w:abstractNumId="8" w15:restartNumberingAfterBreak="0">
     <w:nsid w:val="4F122AD6"/>
     <w:multiLevelType w:val="multilevel"/>
     <w:tmpl w:val="2D9E6420"/>
@@ -2452,7 +4729,7 @@
       </w:rPr>
     </w:lvl>
   </w:abstractNum>
-  <w:abstractNum w:abstractNumId="7" w15:restartNumberingAfterBreak="0">
+  <w:abstractNum w:abstractNumId="9" w15:restartNumberingAfterBreak="0">
     <w:nsid w:val="50B1641C"/>
     <w:multiLevelType w:val="multilevel"/>
     <w:tmpl w:val="A4B41586"/>
@@ -2601,7 +4878,7 @@
       </w:rPr>
     </w:lvl>
   </w:abstractNum>
-  <w:abstractNum w:abstractNumId="8" w15:restartNumberingAfterBreak="0">
+  <w:abstractNum w:abstractNumId="10" w15:restartNumberingAfterBreak="0">
     <w:nsid w:val="549232B5"/>
     <w:multiLevelType w:val="multilevel"/>
     <w:tmpl w:val="08A05B32"/>
@@ -2750,7 +5027,7 @@
       </w:rPr>
     </w:lvl>
   </w:abstractNum>
-  <w:abstractNum w:abstractNumId="9" w15:restartNumberingAfterBreak="0">
+  <w:abstractNum w:abstractNumId="11" w15:restartNumberingAfterBreak="0">
     <w:nsid w:val="57A46FE7"/>
     <w:multiLevelType w:val="multilevel"/>
     <w:tmpl w:val="92CE5278"/>
@@ -2899,7 +5176,7 @@
       </w:rPr>
     </w:lvl>
   </w:abstractNum>
-  <w:abstractNum w:abstractNumId="10" w15:restartNumberingAfterBreak="0">
+  <w:abstractNum w:abstractNumId="12" w15:restartNumberingAfterBreak="0">
     <w:nsid w:val="6E9633F7"/>
     <w:multiLevelType w:val="multilevel"/>
     <w:tmpl w:val="2D9E6420"/>
@@ -3048,10 +5325,10 @@
       </w:rPr>
     </w:lvl>
   </w:abstractNum>
-  <w:abstractNum w:abstractNumId="11" w15:restartNumberingAfterBreak="0">
+  <w:abstractNum w:abstractNumId="13" w15:restartNumberingAfterBreak="0">
     <w:nsid w:val="7E012D75"/>
     <w:multiLevelType w:val="multilevel"/>
-    <w:tmpl w:val="59C2C1AC"/>
+    <w:tmpl w:val="2AC40B6C"/>
     <w:lvl w:ilvl="0">
       <w:start w:val="1"/>
       <w:numFmt w:val="bullet"/>
@@ -3068,20 +5345,15 @@
         <w:sz w:val="20"/>
       </w:rPr>
     </w:lvl>
-    <w:lvl w:ilvl="1" w:tentative="1">
-      <w:start w:val="1"/>
-      <w:numFmt w:val="bullet"/>
-      <w:lvlText w:val=""/>
-      <w:lvlJc w:val="left"/>
-      <w:pPr>
-        <w:tabs>
-          <w:tab w:val="num" w:pos="1440"/>
-        </w:tabs>
+    <w:lvl w:ilvl="1">
+      <w:numFmt w:val="bullet"/>
+      <w:lvlText w:val="-"/>
+      <w:lvlJc w:val="left"/>
+      <w:pPr>
         <w:ind w:left="1440" w:hanging="360"/>
       </w:pPr>
       <w:rPr>
-        <w:rFonts w:ascii="Symbol" w:hAnsi="Symbol" w:hint="default"/>
-        <w:sz w:val="20"/>
+        <w:rFonts w:ascii="Aptos" w:eastAsiaTheme="minorHAnsi" w:hAnsi="Aptos" w:cstheme="minorBidi" w:hint="default"/>
       </w:rPr>
     </w:lvl>
     <w:lvl w:ilvl="2" w:tentative="1">
@@ -3198,40 +5470,46 @@
     </w:lvl>
   </w:abstractNum>
   <w:num w:numId="1" w16cid:durableId="1869634484">
+    <w:abstractNumId w:val="5"/>
+  </w:num>
+  <w:num w:numId="2" w16cid:durableId="814956775">
+    <w:abstractNumId w:val="6"/>
+  </w:num>
+  <w:num w:numId="3" w16cid:durableId="1286810210">
+    <w:abstractNumId w:val="3"/>
+  </w:num>
+  <w:num w:numId="4" w16cid:durableId="904754774">
+    <w:abstractNumId w:val="1"/>
+  </w:num>
+  <w:num w:numId="5" w16cid:durableId="18355847">
+    <w:abstractNumId w:val="8"/>
+  </w:num>
+  <w:num w:numId="6" w16cid:durableId="964580827">
+    <w:abstractNumId w:val="12"/>
+  </w:num>
+  <w:num w:numId="7" w16cid:durableId="56049626">
     <w:abstractNumId w:val="4"/>
   </w:num>
-  <w:num w:numId="2" w16cid:durableId="814956775">
-    <w:abstractNumId w:val="5"/>
+  <w:num w:numId="8" w16cid:durableId="1945649928">
+    <w:abstractNumId w:val="10"/>
   </w:num>
-  <w:num w:numId="3" w16cid:durableId="1286810210">
+  <w:num w:numId="9" w16cid:durableId="591669672">
+    <w:abstractNumId w:val="11"/>
+  </w:num>
+  <w:num w:numId="10" w16cid:durableId="344863096">
+    <w:abstractNumId w:val="9"/>
+  </w:num>
+  <w:num w:numId="11" w16cid:durableId="1188107679">
+    <w:abstractNumId w:val="13"/>
+  </w:num>
+  <w:num w:numId="12" w16cid:durableId="1281572000">
     <w:abstractNumId w:val="2"/>
   </w:num>
-  <w:num w:numId="4" w16cid:durableId="904754774">
-    <w:abstractNumId w:val="0"/>
-  </w:num>
-  <w:num w:numId="5" w16cid:durableId="18355847">
-    <w:abstractNumId w:val="6"/>
-  </w:num>
-  <w:num w:numId="6" w16cid:durableId="964580827">
-    <w:abstractNumId w:val="10"/>
-  </w:num>
-  <w:num w:numId="7" w16cid:durableId="56049626">
-    <w:abstractNumId w:val="3"/>
-  </w:num>
-  <w:num w:numId="8" w16cid:durableId="1945649928">
-    <w:abstractNumId w:val="8"/>
-  </w:num>
-  <w:num w:numId="9" w16cid:durableId="591669672">
-    <w:abstractNumId w:val="9"/>
-  </w:num>
-  <w:num w:numId="10" w16cid:durableId="344863096">
+  <w:num w:numId="13" w16cid:durableId="1236815258">
     <w:abstractNumId w:val="7"/>
   </w:num>
-  <w:num w:numId="11" w16cid:durableId="1188107679">
-    <w:abstractNumId w:val="11"/>
-  </w:num>
-  <w:num w:numId="12" w16cid:durableId="1281572000">
-    <w:abstractNumId w:val="1"/>
+  <w:num w:numId="14" w16cid:durableId="32077745">
+    <w:abstractNumId w:val="0"/>
   </w:num>
 </w:numbering>
 </file>
@@ -3687,7 +5965,6 @@
     <w:next w:val="Normal"/>
     <w:link w:val="Ttulo3Car"/>
     <w:uiPriority w:val="9"/>
-    <w:semiHidden/>
     <w:unhideWhenUsed/>
     <w:qFormat/>
     <w:rsid w:val="002B6595"/>
@@ -3894,7 +6171,6 @@
     <w:basedOn w:val="Fuentedeprrafopredeter"/>
     <w:link w:val="Ttulo3"/>
     <w:uiPriority w:val="9"/>
-    <w:semiHidden/>
     <w:rsid w:val="002B6595"/>
     <w:rPr>
       <w:rFonts w:eastAsiaTheme="majorEastAsia" w:cstheme="majorBidi"/>
@@ -4150,6 +6426,36 @@
       <w:smallCaps/>
       <w:color w:val="0F4761" w:themeColor="accent1" w:themeShade="BF"/>
       <w:spacing w:val="5"/>
+    </w:rPr>
+  </w:style>
+  <w:style w:type="paragraph" w:styleId="NormalWeb">
+    <w:name w:val="Normal (Web)"/>
+    <w:basedOn w:val="Normal"/>
+    <w:uiPriority w:val="99"/>
+    <w:semiHidden/>
+    <w:unhideWhenUsed/>
+    <w:rsid w:val="00A16FD3"/>
+    <w:pPr>
+      <w:spacing w:before="100" w:beforeAutospacing="1" w:after="100" w:afterAutospacing="1" w:line="240" w:lineRule="auto"/>
+    </w:pPr>
+    <w:rPr>
+      <w:rFonts w:ascii="Times New Roman" w:eastAsia="Times New Roman" w:hAnsi="Times New Roman" w:cs="Times New Roman"/>
+      <w:kern w:val="0"/>
+      <w:sz w:val="24"/>
+      <w:szCs w:val="24"/>
+      <w:lang w:eastAsia="es-CO"/>
+      <w14:ligatures w14:val="none"/>
+    </w:rPr>
+  </w:style>
+  <w:style w:type="character" w:styleId="Fuerte">
+    <w:name w:val="Strong"/>
+    <w:basedOn w:val="Fuentedeprrafopredeter"/>
+    <w:uiPriority w:val="22"/>
+    <w:qFormat/>
+    <w:rsid w:val="00A16FD3"/>
+    <w:rPr>
+      <w:b/>
+      <w:bCs/>
     </w:rPr>
   </w:style>
 </w:styles>

</xml_diff>